<commit_message>
Ch1 main-line separation: background vs thesis work disentangled
- Add chapter preamble stating the background (1.1-1.2) / thesis-work
  (1.3) split.
- Move thesis-specific numbers out of background sections into 1.3:
  16.5% write-line IR result -> 1.3.4; T=4 convergence anchor -> keep
  only in 1.3.1; 0.78/1.6 pJ operating-point energies -> 1.3.2; PPA
  net-benefit accounting -> keep only in 1.3.2. Background keeps
  literature facts plus chapter pointers only.
- Complete the in-flight 1.2.3 (theta hosting) section removal from the
  parallel session: renumber 1.2.4->1.2.3, 1.2.5->1.2.4 across all 12
  cross-references; repoint dangling theta references to chapter 4.
- Drop the redundant third positioning sentence in 1.1.2.
- Sync chapter01.docx.

Co-Authored-By: Claude Opus 4.8 <noreply@anthropic.com>
</commit_message>
<xml_diff>
--- a/article/chapter01.docx
+++ b/article/chapter01.docx
@@ -21,6 +21,17 @@
           <w:rFonts w:hint="eastAsia"/>
         </w:rPr>
         <w:t xml:space="preserve">绪论</w:t>
+      </w:r>
+    </w:p>
+    <w:p>
+      <w:pPr>
+        <w:pStyle w:val="FirstParagraph"/>
+      </w:pPr>
+      <w:r>
+        <w:rPr>
+          <w:rFonts w:hint="eastAsia"/>
+        </w:rPr>
+        <w:t xml:space="preserve">本章为全文立论，背景与本文工作分置：1.1节与1.2节为背景，前者梳理由数值计算到概率计算的动因、数学框架与器件实现路径，后者建立概率二值器件与三类任务之间的算法-物理对应并界定尚未闭合的研究空白；1.3节转入本文工作，给出研究思路、创新点与全文组织，本文的主张与定量结果集中于该节及后续各章。</w:t>
       </w:r>
     </w:p>
     <w:bookmarkStart w:id="118" w:name="研究背景从数值计算范式到概率计算范式"/>
@@ -538,16 +549,7 @@
         <w:rPr>
           <w:rFonts w:hint="eastAsia"/>
         </w:rPr>
-        <w:t xml:space="preserve">drop的影响尤为显著</w:t>
-      </w:r>
-      <w:r>
-        <w:t xml:space="preserve"> </w:t>
-      </w:r>
-      <w:r>
-        <w:rPr>
-          <w:rFonts w:hint="eastAsia"/>
-        </w:rPr>
-        <w:t xml:space="preserve">(第四章将给出本文256列写线约16.5%压降的提取结果)。CIM由此在子阵列内部消除了存储墙，却在子阵列之间以部分和搬移的形式重建了它。</w:t>
+        <w:t xml:space="preserve">drop的影响尤为显著。CIM由此在子阵列内部消除了存储墙，却在子阵列之间以部分和搬移的形式重建了它。</w:t>
       </w:r>
     </w:p>
     <w:p>
@@ -1330,95 +1332,66 @@
         <w:rPr>
           <w:rFonts w:hint="eastAsia"/>
         </w:rPr>
-        <w:t xml:space="preserve">，本文第四章将给出推理精度在</w:t>
+        <w:t xml:space="preserve">。在物理上，这一语义对硬件的需求从高精度乘法器加高带宽访存，转为可调概率的二值单元加计数器；后者可直接利用器件的本征物理属性</w:t>
+      </w:r>
+      <w:r>
+        <w:t xml:space="preserve"> </w:t>
+      </w:r>
+      <w:r>
+        <w:rPr>
+          <w:rFonts w:hint="eastAsia"/>
+        </w:rPr>
+        <w:t xml:space="preserve">(如热涨落)，而前者须以精细的电路设计抑制这类属性</w:t>
+      </w:r>
+      <w:r>
+        <w:t xml:space="preserve"> </w:t>
+      </w:r>
+      <w:r>
+        <w:rPr>
+          <w:rFonts w:hint="eastAsia"/>
+        </w:rPr>
+        <w:t xml:space="preserve">(噪声、偏差)。原本视作缺陷的器件噪声由此被纳入计算的基本资源。</w:t>
+      </w:r>
+    </w:p>
+    <w:p>
+      <w:pPr>
+        <w:pStyle w:val="BodyText"/>
+      </w:pPr>
+      <w:r>
+        <w:rPr>
+          <w:rFonts w:hint="eastAsia"/>
+        </w:rPr>
+        <w:t xml:space="preserve">在该范式下，1.1.1节所列的开销逐项对应地被压缩：权重在存算阵列中仅以单比特出现，阵列本体无需多比特元胞，存储密度与常规MRAM相当</w:t>
+      </w:r>
+      <w:r>
+        <w:t xml:space="preserve"> </w:t>
+      </w:r>
+      <w:r>
+        <w:rPr>
+          <w:rFonts w:hint="eastAsia"/>
+        </w:rPr>
+        <w:t xml:space="preserve">(分布参数以数字码字存于外围而非阵列内，见第四章)；乘加退化为异或与计数，高分辨列级ADC让位于低分辨读出与计数累加；随机源来自器件本身，专用熵源电路可以省去。三项变化同时发生的根源在于概率取代精度这一计算语义的改变，而非某一具体电路优化的累积。</w:t>
+      </w:r>
+    </w:p>
+    <w:p>
+      <w:pPr>
+        <w:pStyle w:val="BodyText"/>
+      </w:pPr>
+      <w:r>
+        <w:rPr>
+          <w:rFonts w:hint="eastAsia"/>
+        </w:rPr>
+        <w:t xml:space="preserve">还需指出，在这条以统计代替精度的路径内，器件随机性可被使用的方式有两种，二者都以随机二值事件的统计平均替代高精度运算，区别在于是否保留器件的时域状态。其一为无记忆采样：相邻取样彼此独立，统计平均估计一个静态量，精度由采样次数</w:t>
       </w:r>
       <m:oMath>
         <m:r>
           <m:t>T</m:t>
         </m:r>
-        <m:r>
-          <m:rPr>
-            <m:sty m:val="p"/>
-          </m:rPr>
-          <m:t>=</m:t>
-        </m:r>
-        <m:r>
-          <m:t>4</m:t>
-        </m:r>
       </m:oMath>
       <w:r>
         <w:rPr>
           <w:rFonts w:hint="eastAsia"/>
         </w:rPr>
-        <w:t xml:space="preserve">次采样即收敛于渐近值的任务级证据，恰属该优势区间。在物理上，这一语义对硬件的需求从高精度乘法器加高带宽访存，转为可调概率的二值单元加计数器；后者可直接利用器件的本征物理属性</w:t>
-      </w:r>
-      <w:r>
-        <w:t xml:space="preserve"> </w:t>
-      </w:r>
-      <w:r>
-        <w:rPr>
-          <w:rFonts w:hint="eastAsia"/>
-        </w:rPr>
-        <w:t xml:space="preserve">(如热涨落)，而前者须以精细的电路设计抑制这类属性</w:t>
-      </w:r>
-      <w:r>
-        <w:t xml:space="preserve"> </w:t>
-      </w:r>
-      <w:r>
-        <w:rPr>
-          <w:rFonts w:hint="eastAsia"/>
-        </w:rPr>
-        <w:t xml:space="preserve">(噪声、偏差)。原本视作缺陷的器件噪声由此被纳入计算的基本资源。</w:t>
-      </w:r>
-    </w:p>
-    <w:p>
-      <w:pPr>
-        <w:pStyle w:val="BodyText"/>
-      </w:pPr>
-      <w:r>
-        <w:rPr>
-          <w:rFonts w:hint="eastAsia"/>
-        </w:rPr>
-        <w:t xml:space="preserve">在该范式下，1.1.1节所列的开销逐项对应地被压缩：权重在存算阵列中仅以单比特出现，阵列本体无需多比特元胞，存储密度与常规MRAM相当</w:t>
-      </w:r>
-      <w:r>
-        <w:t xml:space="preserve"> </w:t>
-      </w:r>
-      <w:r>
-        <w:rPr>
-          <w:rFonts w:hint="eastAsia"/>
-        </w:rPr>
-        <w:t xml:space="preserve">(分布参数的存放方式见1.2.3节)；乘加退化为异或与计数，高分辨列级ADC让位于低分辨读出与计数累加；随机源来自器件本身，专用熵源电路可以省去</w:t>
-      </w:r>
-      <w:r>
-        <w:t xml:space="preserve"> </w:t>
-      </w:r>
-      <w:r>
-        <w:rPr>
-          <w:rFonts w:hint="eastAsia"/>
-        </w:rPr>
-        <w:t xml:space="preserve">(计入新增外围后的净收益由第四章PPA分析核算)。三项变化同时发生的根源在于概率取代精度这一计算语义的改变，而非某一具体电路优化的累积。本文的研究即处于该范式之内。</w:t>
-      </w:r>
-    </w:p>
-    <w:p>
-      <w:pPr>
-        <w:pStyle w:val="BodyText"/>
-      </w:pPr>
-      <w:r>
-        <w:rPr>
-          <w:rFonts w:hint="eastAsia"/>
-        </w:rPr>
-        <w:t xml:space="preserve">还需指出，在这条以统计代替精度的路径内，器件随机性可被使用的方式有两种，二者都以随机二值事件的统计平均替代高精度运算，区别在于是否保留器件的时域状态。其一为无记忆采样：相邻取样彼此独立，统计平均估计一个静态量，精度由采样次数</w:t>
-      </w:r>
-      <m:oMath>
-        <m:r>
-          <m:t>T</m:t>
-        </m:r>
-      </m:oMath>
-      <w:r>
-        <w:rPr>
-          <w:rFonts w:hint="eastAsia"/>
-        </w:rPr>
         <w:t xml:space="preserve">而非比特位宽决定，组合优化的伊辛机</w:t>
       </w:r>
       <w:r>
@@ -1473,7 +1446,7 @@
         <w:rPr>
           <w:rFonts w:hint="eastAsia"/>
         </w:rPr>
-        <w:t xml:space="preserve">computing)。两种方式共享同一类sMTJ概率二值单元与同一条由随机事件到统计读出的主干，本文据此沿两条路径展开：1.1.3至1.1.6节梳理无记忆采样下的伊辛与PBNN脉络，1.2.4节给出有状态动力学的器件-算法对应，1.2.5节梳理其研究现状，1.3.3节阐明研究动机与本文定位。</w:t>
+        <w:t xml:space="preserve">computing)。两种方式共享同一类sMTJ概率二值单元与同一条由随机事件到统计读出的主干，本文据此沿两条路径展开：1.1.3至1.1.6节梳理无记忆采样下的伊辛与PBNN脉络，1.2.3节给出有状态动力学的器件-算法对应，1.2.4节梳理其研究现状，1.3.3节阐明研究动机与本文定位。</w:t>
       </w:r>
     </w:p>
     <w:bookmarkEnd w:id="64"/>
@@ -4198,7 +4171,7 @@
         <w:rPr>
           <w:rFonts w:hint="eastAsia"/>
         </w:rPr>
-        <w:t xml:space="preserve">互译后，RBM能量函数与伊辛/Hopfield能量函数仅在常数项与偏置重定标处有差异，本质上属于同一类对象。由此可勾勒出一条清晰的演化路径：伊辛模型给出对称二值耦合系统的能量描述与平衡态统计；Hopfield网络以确定性动力学将该能量描述用于计算，建立”能量极小即为答案”的范式；引入热噪声使其转化为对玻尔兹曼分布的采样器，并在优化侧导出模拟退火；玻尔兹曼机引入隐含单元与最大似然学习，使该范式从优化器扩展为可学习的生成模型；RBM、DBN与DBM通过拓扑约束和深层堆叠推动无向能量模型继续发展；sigmoid信念网络则在有向图方向保留了Sigmoid条件采样；现代BNN与PBNN进一步把二值随机单元嵌入按层前馈、可反向传播的深度网络。各分支的差异在于网络拓扑、更新调度与学习目标，而它们在局部二值采样层面共享Sigmoid型条件概率。需要说明，上述脉络以能量函数与平衡态采样为共同基础；1.1.2节所引出的概率二值储备池计算并不通过能量极小化求解，而是利用器件的非平衡时域动力学，因而是一条与之并行、而非由其衍生的分支，其研究现状与空白见1.2.5节，研究动机与本文定位见1.3.3节。</w:t>
+        <w:t xml:space="preserve">互译后，RBM能量函数与伊辛/Hopfield能量函数仅在常数项与偏置重定标处有差异，本质上属于同一类对象。由此可勾勒出一条清晰的演化路径：伊辛模型给出对称二值耦合系统的能量描述与平衡态统计；Hopfield网络以确定性动力学将该能量描述用于计算，建立”能量极小即为答案”的范式；引入热噪声使其转化为对玻尔兹曼分布的采样器，并在优化侧导出模拟退火；玻尔兹曼机引入隐含单元与最大似然学习，使该范式从优化器扩展为可学习的生成模型；RBM、DBN与DBM通过拓扑约束和深层堆叠推动无向能量模型继续发展；sigmoid信念网络则在有向图方向保留了Sigmoid条件采样；现代BNN与PBNN进一步把二值随机单元嵌入按层前馈、可反向传播的深度网络。各分支的差异在于网络拓扑、更新调度与学习目标，而它们在局部二值采样层面共享Sigmoid型条件概率。需要说明，上述脉络以能量函数与平衡态采样为共同基础；1.1.2节所引出的概率二值储备池计算并不通过能量极小化求解，而是利用器件的非平衡时域动力学，因而是一条与之并行、而非由其衍生的分支，其研究现状与空白见1.2.4节，研究动机与本文定位见1.3.3节。</w:t>
       </w:r>
     </w:p>
     <w:p>
@@ -4792,34 +4765,7 @@
         <w:rPr>
           <w:rFonts w:hint="eastAsia"/>
         </w:rPr>
-        <w:t xml:space="preserve">；亚临界写脉冲采样在本文标定工作点的器件级写耗约0.78</w:t>
-      </w:r>
-      <w:r>
-        <w:t xml:space="preserve"> </w:t>
-      </w:r>
-      <w:r>
-        <w:rPr>
-          <w:rFonts w:hint="eastAsia"/>
-        </w:rPr>
-        <w:t xml:space="preserve">pJ/次</w:t>
-      </w:r>
-      <w:r>
-        <w:t xml:space="preserve"> </w:t>
-      </w:r>
-      <w:r>
-        <w:rPr>
-          <w:rFonts w:hint="eastAsia"/>
-        </w:rPr>
-        <w:t xml:space="preserve">(第二章；计入sky130写驱动后端到端约1.6</w:t>
-      </w:r>
-      <w:r>
-        <w:t xml:space="preserve"> </w:t>
-      </w:r>
-      <w:r>
-        <w:rPr>
-          <w:rFonts w:hint="eastAsia"/>
-        </w:rPr>
-        <w:t xml:space="preserve">pJ，见第四章)，而CMOS</w:t>
+        <w:t xml:space="preserve">；而CMOS</w:t>
       </w:r>
       <w:r>
         <w:t xml:space="preserve"> </w:t>
@@ -4846,7 +4792,7 @@
         <w:rPr>
           <w:rFonts w:hint="eastAsia"/>
         </w:rPr>
-        <w:t xml:space="preserve">约5</w:t>
+        <w:t xml:space="preserve">约需5</w:t>
       </w:r>
       <w:r>
         <w:t xml:space="preserve"> pJ</w:t>
@@ -4861,7 +4807,7 @@
         <w:rPr>
           <w:rFonts w:hint="eastAsia"/>
         </w:rPr>
-        <w:t xml:space="preserve">，即便按端到端口径sMTJ仍显著更低；本征非易失，静态功耗接近零；超顺磁弛豫时间已实测短至8</w:t>
+        <w:t xml:space="preserve">，写脉冲采样方式的能耗依工作点而定，本文工作点的定量核算见1.3.2节；本征非易失，静态功耗接近零；超顺磁弛豫时间已实测短至8</w:t>
       </w:r>
       <w:r>
         <w:t xml:space="preserve"> ns</w:t>
@@ -5182,7 +5128,7 @@
     </w:p>
     <w:bookmarkEnd w:id="117"/>
     <w:bookmarkEnd w:id="118"/>
-    <w:bookmarkStart w:id="170" w:name="概率二值计算的器件-算法协同机制"/>
+    <w:bookmarkStart w:id="169" w:name="概率二值计算的器件-算法协同机制"/>
     <w:p>
       <w:pPr>
         <w:pStyle w:val="Heading2"/>
@@ -5259,16 +5205,16 @@
         <w:rPr>
           <w:rFonts w:hint="eastAsia"/>
         </w:rPr>
-        <w:t xml:space="preserve">(1.2.1至1.2.3节)，因其最充分地串起单元级采样与阵列级求和；再给出有状态模式下储备池的器件-算法对应</w:t>
-      </w:r>
-      <w:r>
-        <w:t xml:space="preserve"> </w:t>
-      </w:r>
-      <w:r>
-        <w:rPr>
-          <w:rFonts w:hint="eastAsia"/>
-        </w:rPr>
-        <w:t xml:space="preserve">(1.2.4节)；两种模式由同一sMTJ物理</w:t>
+        <w:t xml:space="preserve">(1.2.1至1.2.2节)，因其最充分地串起单元级采样与阵列级求和；再给出有状态模式下储备池的器件-算法对应</w:t>
+      </w:r>
+      <w:r>
+        <w:t xml:space="preserve"> </w:t>
+      </w:r>
+      <w:r>
+        <w:rPr>
+          <w:rFonts w:hint="eastAsia"/>
+        </w:rPr>
+        <w:t xml:space="preserve">(1.2.3节)；两种模式由同一sMTJ物理</w:t>
       </w:r>
       <w:r>
         <w:t xml:space="preserve"> </w:t>
@@ -5286,7 +5232,7 @@
         <w:rPr>
           <w:rFonts w:hint="eastAsia"/>
         </w:rPr>
-        <w:t xml:space="preserve">支撑，差异在于如何读出与是否保留状态，而非是否依赖统计；在此基础上，1.2.5节沿这两种利用方式分别梳理研究现状与尚未闭合的空白。</w:t>
+        <w:t xml:space="preserve">支撑，差异在于如何读出与是否保留状态，而非是否依赖统计；在此基础上，1.2.4节沿这两种利用方式分别梳理研究现状与尚未闭合的空白。</w:t>
       </w:r>
     </w:p>
     <w:bookmarkStart w:id="120" w:name="无记忆采样pbnn的前向数学与clt桥梁"/>
@@ -8965,521 +8911,139 @@
       </w:r>
     </w:p>
     <w:bookmarkEnd w:id="136"/>
-    <w:bookmarkStart w:id="137" w:name="theta_ij的硬件栖居参数样本与作用"/>
+    <w:bookmarkStart w:id="139" w:name="有状态动力学储备池计算的器件-算法对应"/>
     <w:p>
       <w:pPr>
         <w:pStyle w:val="Heading3"/>
       </w:pPr>
       <w:r>
-        <w:t xml:space="preserve">1.2.3</w:t>
-      </w:r>
-      <w:r>
-        <w:t xml:space="preserve"> </w:t>
+        <w:t xml:space="preserve">1.2.3 </w:t>
+      </w:r>
+      <w:r>
+        <w:rPr>
+          <w:rFonts w:hint="eastAsia"/>
+        </w:rPr>
+        <w:t xml:space="preserve">有状态动力学：储备池计算的器件-算法对应</w:t>
+      </w:r>
+    </w:p>
+    <w:p>
+      <w:pPr>
+        <w:pStyle w:val="FirstParagraph"/>
+      </w:pPr>
+      <w:r>
+        <w:rPr>
+          <w:rFonts w:hint="eastAsia"/>
+        </w:rPr>
+        <w:t xml:space="preserve">若不再每步重置同一sMTJ，而任其自由演化，器件便从无记忆采样源变为有状态的随机电报节点；前述统计代替精度原则依然适用，只是读出对象与时间结构都发生变化。节点的模拟激活由一个读出窗口内对</w:t>
       </w:r>
       <m:oMath>
-        <m:sSub>
-          <m:e>
-            <m:r>
-              <m:t>θ</m:t>
-            </m:r>
-          </m:e>
-          <m:sub>
-            <m:r>
-              <m:t>i</m:t>
-            </m:r>
-            <m:r>
-              <m:t>j</m:t>
-            </m:r>
-          </m:sub>
-        </m:sSub>
+        <m:r>
+          <m:rPr>
+            <m:sty m:val="p"/>
+          </m:rPr>
+          <m:t>±</m:t>
+        </m:r>
+        <m:r>
+          <m:t>1</m:t>
+        </m:r>
       </m:oMath>
       <w:r>
         <w:rPr>
           <w:rFonts w:hint="eastAsia"/>
         </w:rPr>
-        <w:t xml:space="preserve">的硬件栖居：参数、样本与作用</w:t>
-      </w:r>
-    </w:p>
-    <w:p>
-      <w:pPr>
-        <w:pStyle w:val="FirstParagraph"/>
-      </w:pPr>
-      <w:r>
-        <w:rPr>
-          <w:rFonts w:hint="eastAsia"/>
-        </w:rPr>
-        <w:t xml:space="preserve">PBNN不存储确定性权重而存储分布参数</w:t>
+        <w:t xml:space="preserve">态的平均给出</w:t>
+      </w:r>
+      <w:r>
+        <w:t xml:space="preserve"> </w:t>
+      </w:r>
+      <w:r>
+        <w:rPr>
+          <w:rFonts w:hint="eastAsia"/>
+        </w:rPr>
+        <w:t xml:space="preserve">(集合维度上由多器件并行、时间维度上由窗口内多次采样)，精度同样由样本数而非比特位宽决定。与无记忆模式的差别在于，器件磁化在窗口之间保持相关，弛豫时间</w:t>
       </w:r>
       <m:oMath>
-        <m:sSub>
-          <m:e>
-            <m:r>
-              <m:t>θ</m:t>
-            </m:r>
-          </m:e>
-          <m:sub>
-            <m:r>
-              <m:t>i</m:t>
-            </m:r>
-            <m:r>
-              <m:t>j</m:t>
-            </m:r>
-          </m:sub>
-        </m:sSub>
+        <m:r>
+          <m:t>τ</m:t>
+        </m:r>
       </m:oMath>
       <w:r>
         <w:rPr>
           <w:rFonts w:hint="eastAsia"/>
         </w:rPr>
-        <w:t xml:space="preserve">，这一陈述在硬件上需进一步澄清。直觉式理解容易误认为要在阵列中用多比特单元保存连续的</w:t>
+        <w:t xml:space="preserve">内的历史不被抹去，由此提供衰减记忆；储备池计算正利用这一点，以固定且不训练的随机节点群把输入历史映射到高维状态，仅训练线性读出。</w:t>
+      </w:r>
+    </w:p>
+    <w:p>
+      <w:pPr>
+        <w:pStyle w:val="BodyText"/>
+      </w:pPr>
+      <w:r>
+        <w:rPr>
+          <w:rFonts w:hint="eastAsia"/>
+        </w:rPr>
+        <w:t xml:space="preserve">由此可把储备池的算法需求与sMTJ物理逐项对应，与1.2.1节的无记忆映射形成对照：非线性来自稳态平均磁化对偏置的</w:t>
       </w:r>
       <m:oMath>
-        <m:sSub>
-          <m:e>
-            <m:r>
-              <m:t>θ</m:t>
-            </m:r>
-          </m:e>
-          <m:sub>
-            <m:r>
-              <m:t>i</m:t>
-            </m:r>
-            <m:r>
-              <m:t>j</m:t>
-            </m:r>
-          </m:sub>
-        </m:sSub>
+        <m:r>
+          <m:rPr>
+            <m:sty m:val="p"/>
+          </m:rPr>
+          <m:t>tanh</m:t>
+        </m:r>
       </m:oMath>
       <w:r>
         <w:rPr>
           <w:rFonts w:hint="eastAsia"/>
         </w:rPr>
-        <w:t xml:space="preserve">，但这会抹掉MRAM作为单比特器件的全部优势，与前节所述的Sigmoid直接对齐相矛盾。</w:t>
-      </w:r>
-    </w:p>
-    <w:p>
-      <w:pPr>
-        <w:pStyle w:val="BodyText"/>
-      </w:pPr>
+        <w:t xml:space="preserve">型依赖</w:t>
+      </w:r>
+      <w:r>
+        <w:t xml:space="preserve"> </w:t>
+      </w:r>
+      <w:r>
+        <w:rPr>
+          <w:rFonts w:hint="eastAsia"/>
+        </w:rPr>
+        <w:t xml:space="preserve">(即翻转速率所决定的</w:t>
+      </w:r>
       <m:oMath>
-        <m:sSub>
-          <m:e>
-            <m:r>
-              <m:t>θ</m:t>
-            </m:r>
-          </m:e>
-          <m:sub>
-            <m:r>
-              <m:t>i</m:t>
-            </m:r>
-            <m:r>
-              <m:t>j</m:t>
-            </m:r>
-          </m:sub>
-        </m:sSub>
+        <m:r>
+          <m:rPr>
+            <m:sty m:val="p"/>
+          </m:rPr>
+          <m:t>±</m:t>
+        </m:r>
+        <m:r>
+          <m:t>1</m:t>
+        </m:r>
       </m:oMath>
       <w:r>
         <w:rPr>
           <w:rFonts w:hint="eastAsia"/>
         </w:rPr>
-        <w:t xml:space="preserve">以两种形态分别栖居于片上两个子系统。在外围数字域，每个</w:t>
+        <w:t xml:space="preserve">占据均值)；衰减记忆来自相关时间</w:t>
       </w:r>
       <m:oMath>
-        <m:sSub>
-          <m:e>
-            <m:r>
-              <m:t>θ</m:t>
-            </m:r>
-          </m:e>
-          <m:sub>
-            <m:r>
-              <m:t>i</m:t>
-            </m:r>
-            <m:r>
-              <m:t>j</m:t>
-            </m:r>
-          </m:sub>
-        </m:sSub>
+        <m:r>
+          <m:t>τ</m:t>
+        </m:r>
       </m:oMath>
       <w:r>
         <w:rPr>
           <w:rFonts w:hint="eastAsia"/>
         </w:rPr>
-        <w:t xml:space="preserve">作为可训练标量保存在靠近阵列的SRAM寄存器或片上缓存中：训练态保持高精度以稳定梯度累积，反向传播更新的正是这些数字寄存器；推理态只需装载量化后的低位宽码字，由控制器经DAC转换为模拟写入电压</w:t>
+        <w:t xml:space="preserve">，且</w:t>
       </w:r>
       <m:oMath>
-        <m:sSubSup>
-          <m:e>
-            <m:r>
-              <m:t>V</m:t>
-            </m:r>
-          </m:e>
-          <m:sub>
-            <m:r>
-              <m:rPr>
-                <m:sty m:val="p"/>
-              </m:rPr>
-              <m:t>w</m:t>
-            </m:r>
-            <m:r>
-              <m:rPr>
-                <m:sty m:val="p"/>
-              </m:rPr>
-              <m:t>r</m:t>
-            </m:r>
-          </m:sub>
-          <m:sup>
-            <m:r>
-              <m:rPr>
-                <m:sty m:val="p"/>
-              </m:rPr>
-              <m:t>(</m:t>
-            </m:r>
-            <m:r>
-              <m:t>i</m:t>
-            </m:r>
-            <m:r>
-              <m:t>j</m:t>
-            </m:r>
-            <m:r>
-              <m:rPr>
-                <m:sty m:val="p"/>
-              </m:rPr>
-              <m:t>)</m:t>
-            </m:r>
-          </m:sup>
-        </m:sSubSup>
+        <m:r>
+          <m:t>τ</m:t>
+        </m:r>
       </m:oMath>
       <w:r>
         <w:rPr>
           <w:rFonts w:hint="eastAsia"/>
         </w:rPr>
-        <w:t xml:space="preserve">。这一侧与常规数字-模拟接口并无不同；系统级的参数存储由此落在外围数字域而非阵列内，其面积开销与常规CIM的权重缓存同类，存算阵列本体则保持1比特/单元的密度。在存算阵列的MTJ本体侧，任一瞬时的MTJ仅持有1比特</w:t>
-      </w:r>
-      <w:r>
-        <w:t xml:space="preserve"> </w:t>
-      </w:r>
-      <w:r>
-        <w:rPr>
-          <w:rFonts w:hint="eastAsia"/>
-        </w:rPr>
-        <w:t xml:space="preserve">(当前磁化状态)，但该比特作为参数载体的信息量并不在其当前值，而在给定相同</w:t>
-      </w:r>
-      <m:oMath>
-        <m:sSub>
-          <m:e>
-            <m:r>
-              <m:t>V</m:t>
-            </m:r>
-          </m:e>
-          <m:sub>
-            <m:r>
-              <m:rPr>
-                <m:sty m:val="p"/>
-              </m:rPr>
-              <m:t>w</m:t>
-            </m:r>
-            <m:r>
-              <m:rPr>
-                <m:sty m:val="p"/>
-              </m:rPr>
-              <m:t>r</m:t>
-            </m:r>
-          </m:sub>
-        </m:sSub>
-      </m:oMath>
-      <w:r>
-        <w:rPr>
-          <w:rFonts w:hint="eastAsia"/>
-        </w:rPr>
-        <w:t xml:space="preserve">下其翻转概率，即统计意义上的分布参数。</w:t>
-      </w:r>
-    </w:p>
-    <w:p>
-      <w:pPr>
-        <w:pStyle w:val="BodyText"/>
-      </w:pPr>
-      <w:r>
-        <w:rPr>
-          <w:rFonts w:hint="eastAsia"/>
-        </w:rPr>
-        <w:t xml:space="preserve">换言之，</w:t>
-      </w:r>
-      <m:oMath>
-        <m:sSub>
-          <m:e>
-            <m:r>
-              <m:t>θ</m:t>
-            </m:r>
-          </m:e>
-          <m:sub>
-            <m:r>
-              <m:t>i</m:t>
-            </m:r>
-            <m:r>
-              <m:t>j</m:t>
-            </m:r>
-          </m:sub>
-        </m:sSub>
-      </m:oMath>
-      <w:r>
-        <w:rPr>
-          <w:rFonts w:hint="eastAsia"/>
-        </w:rPr>
-        <w:t xml:space="preserve">并非存放在MTJ内部，而是通过每次写入电压的调制作用于MTJ；MTJ所存的，是该分布的一次实例化样本。这一解读直接对应统计学中参数</w:t>
-      </w:r>
-      <w:r>
-        <w:t xml:space="preserve"> (parameter) </w:t>
-      </w:r>
-      <w:r>
-        <w:rPr>
-          <w:rFonts w:hint="eastAsia"/>
-        </w:rPr>
-        <w:t xml:space="preserve">与样本</w:t>
-      </w:r>
-      <w:r>
-        <w:t xml:space="preserve"> (sample) </w:t>
-      </w:r>
-      <w:r>
-        <w:rPr>
-          <w:rFonts w:hint="eastAsia"/>
-        </w:rPr>
-        <w:t xml:space="preserve">的区分：PBNN的权重张量是参数张量而非样本张量；样本是其每一次前向采样的产物，在时域上每个采样周期不同。</w:t>
-      </w:r>
-    </w:p>
-    <w:p>
-      <w:pPr>
-        <w:pStyle w:val="BodyText"/>
-      </w:pPr>
-      <w:r>
-        <w:rPr>
-          <w:rFonts w:hint="eastAsia"/>
-        </w:rPr>
-        <w:t xml:space="preserve">该解读带来三项工程含义。阵列的存储密度按1比特/权重计算，与常规MRAM相当，分布参数不在阵列内占据额外元胞。DAC精度只需能分辨</w:t>
-      </w:r>
-      <m:oMath>
-        <m:r>
-          <m:t>σ</m:t>
-        </m:r>
-        <m:r>
-          <m:rPr>
-            <m:sty m:val="p"/>
-          </m:rPr>
-          <m:t>(</m:t>
-        </m:r>
-        <m:sSub>
-          <m:e>
-            <m:r>
-              <m:t>θ</m:t>
-            </m:r>
-          </m:e>
-          <m:sub>
-            <m:r>
-              <m:t>i</m:t>
-            </m:r>
-            <m:r>
-              <m:t>j</m:t>
-            </m:r>
-          </m:sub>
-        </m:sSub>
-        <m:r>
-          <m:rPr>
-            <m:sty m:val="p"/>
-          </m:rPr>
-          <m:t>)</m:t>
-        </m:r>
-      </m:oMath>
-      <w:r>
-        <w:rPr>
-          <w:rFonts w:hint="eastAsia"/>
-        </w:rPr>
-        <w:t xml:space="preserve">过渡区间的斜率，典型4–6位即可满足概率分辨需求，计入逐行IR预畸变与逐列微调后为6–7位</w:t>
-      </w:r>
-      <w:r>
-        <w:t xml:space="preserve"> </w:t>
-      </w:r>
-      <w:r>
-        <w:rPr>
-          <w:rFonts w:hint="eastAsia"/>
-        </w:rPr>
-        <w:t xml:space="preserve">(第四章)；DAC按行复用，不增加单元面积。阵列单元本身的器件变异</w:t>
-      </w:r>
-      <w:r>
-        <w:t xml:space="preserve"> </w:t>
-      </w:r>
-      <w:r>
-        <w:rPr>
-          <w:rFonts w:hint="eastAsia"/>
-        </w:rPr>
-        <w:t xml:space="preserve">(切换电压分布、TMR分布、势垒高度)</w:t>
-      </w:r>
-      <w:r>
-        <w:t xml:space="preserve"> </w:t>
-      </w:r>
-      <w:r>
-        <w:rPr>
-          <w:rFonts w:hint="eastAsia"/>
-        </w:rPr>
-        <w:t xml:space="preserve">直接决定实际</w:t>
-      </w:r>
-      <m:oMath>
-        <m:sSub>
-          <m:e>
-            <m:r>
-              <m:t>p</m:t>
-            </m:r>
-          </m:e>
-          <m:sub>
-            <m:r>
-              <m:t>i</m:t>
-            </m:r>
-            <m:r>
-              <m:t>j</m:t>
-            </m:r>
-          </m:sub>
-        </m:sSub>
-      </m:oMath>
-      <w:r>
-        <w:rPr>
-          <w:rFonts w:hint="eastAsia"/>
-        </w:rPr>
-        <w:t xml:space="preserve">相对目标值的偏差，与传统CIM量化误差的视角截然不同：误差不来自位宽不够，而来自物理概率相对理想Sigmoid的偏移。这正是后续章节进行仿真建模时所要刻画的核心非理想效应。</w:t>
-      </w:r>
-    </w:p>
-    <w:bookmarkEnd w:id="137"/>
-    <w:bookmarkStart w:id="140" w:name="有状态动力学储备池计算的器件-算法对应"/>
-    <w:p>
-      <w:pPr>
-        <w:pStyle w:val="Heading3"/>
-      </w:pPr>
-      <w:r>
-        <w:t xml:space="preserve">1.2.4 </w:t>
-      </w:r>
-      <w:r>
-        <w:rPr>
-          <w:rFonts w:hint="eastAsia"/>
-        </w:rPr>
-        <w:t xml:space="preserve">有状态动力学：储备池计算的器件-算法对应</w:t>
-      </w:r>
-    </w:p>
-    <w:p>
-      <w:pPr>
-        <w:pStyle w:val="FirstParagraph"/>
-      </w:pPr>
-      <w:r>
-        <w:rPr>
-          <w:rFonts w:hint="eastAsia"/>
-        </w:rPr>
-        <w:t xml:space="preserve">若不再每步重置同一sMTJ，而任其自由演化，器件便从无记忆采样源变为有状态的随机电报节点；前述统计代替精度原则依然适用，只是读出对象与时间结构都发生变化。节点的模拟激活由一个读出窗口内对</w:t>
-      </w:r>
-      <m:oMath>
-        <m:r>
-          <m:rPr>
-            <m:sty m:val="p"/>
-          </m:rPr>
-          <m:t>±</m:t>
-        </m:r>
-        <m:r>
-          <m:t>1</m:t>
-        </m:r>
-      </m:oMath>
-      <w:r>
-        <w:rPr>
-          <w:rFonts w:hint="eastAsia"/>
-        </w:rPr>
-        <w:t xml:space="preserve">态的平均给出</w:t>
-      </w:r>
-      <w:r>
-        <w:t xml:space="preserve"> </w:t>
-      </w:r>
-      <w:r>
-        <w:rPr>
-          <w:rFonts w:hint="eastAsia"/>
-        </w:rPr>
-        <w:t xml:space="preserve">(集合维度上由多器件并行、时间维度上由窗口内多次采样)，精度同样由样本数而非比特位宽决定。与无记忆模式的差别在于，器件磁化在窗口之间保持相关，弛豫时间</w:t>
-      </w:r>
-      <m:oMath>
-        <m:r>
-          <m:t>τ</m:t>
-        </m:r>
-      </m:oMath>
-      <w:r>
-        <w:rPr>
-          <w:rFonts w:hint="eastAsia"/>
-        </w:rPr>
-        <w:t xml:space="preserve">内的历史不被抹去，由此提供衰减记忆；储备池计算正利用这一点，以固定且不训练的随机节点群把输入历史映射到高维状态，仅训练线性读出。</w:t>
-      </w:r>
-    </w:p>
-    <w:p>
-      <w:pPr>
-        <w:pStyle w:val="BodyText"/>
-      </w:pPr>
-      <w:r>
-        <w:rPr>
-          <w:rFonts w:hint="eastAsia"/>
-        </w:rPr>
-        <w:t xml:space="preserve">由此可把储备池的算法需求与sMTJ物理逐项对应，与1.2.1节的无记忆映射形成对照：非线性来自稳态平均磁化对偏置的</w:t>
-      </w:r>
-      <m:oMath>
-        <m:r>
-          <m:rPr>
-            <m:sty m:val="p"/>
-          </m:rPr>
-          <m:t>tanh</m:t>
-        </m:r>
-      </m:oMath>
-      <w:r>
-        <w:rPr>
-          <w:rFonts w:hint="eastAsia"/>
-        </w:rPr>
-        <w:t xml:space="preserve">型依赖</w:t>
-      </w:r>
-      <w:r>
-        <w:t xml:space="preserve"> </w:t>
-      </w:r>
-      <w:r>
-        <w:rPr>
-          <w:rFonts w:hint="eastAsia"/>
-        </w:rPr>
-        <w:t xml:space="preserve">(即翻转速率所决定的</w:t>
-      </w:r>
-      <m:oMath>
-        <m:r>
-          <m:rPr>
-            <m:sty m:val="p"/>
-          </m:rPr>
-          <m:t>±</m:t>
-        </m:r>
-        <m:r>
-          <m:t>1</m:t>
-        </m:r>
-      </m:oMath>
-      <w:r>
-        <w:rPr>
-          <w:rFonts w:hint="eastAsia"/>
-        </w:rPr>
-        <w:t xml:space="preserve">占据均值)；衰减记忆来自相关时间</w:t>
-      </w:r>
-      <m:oMath>
-        <m:r>
-          <m:t>τ</m:t>
-        </m:r>
-      </m:oMath>
-      <w:r>
-        <w:rPr>
-          <w:rFonts w:hint="eastAsia"/>
-        </w:rPr>
-        <w:t xml:space="preserve">，且</w:t>
-      </w:r>
-      <m:oMath>
-        <m:r>
-          <m:t>τ</m:t>
-        </m:r>
-      </m:oMath>
-      <w:r>
-        <w:rPr>
-          <w:rFonts w:hint="eastAsia"/>
-        </w:rPr>
         <w:t xml:space="preserve">随偏置电压指数可调；高维投影来自器件群体及其参数离散</w:t>
       </w:r>
       <w:r>
@@ -9495,7 +9059,7 @@
         <w:rPr>
           <w:rStyle w:val="FootnoteReference"/>
         </w:rPr>
-        <w:footnoteReference w:id="138"/>
+        <w:footnoteReference w:id="137"/>
       </w:r>
       <w:r>
         <w:rPr>
@@ -9559,14 +9123,14 @@
         <w:t xml:space="preserve">的递归乘加，这是有状态模式相对数字回声状态网络的根本节省。本小节只交代器件-算法接口本身；该路径与其他物理储备池的比较及研究现状见下节，研究动机与本文定位见1.3.3节。</w:t>
       </w:r>
     </w:p>
-    <w:bookmarkEnd w:id="140"/>
-    <w:bookmarkStart w:id="169" w:name="研究现状与尚未闭合的空白"/>
+    <w:bookmarkEnd w:id="139"/>
+    <w:bookmarkStart w:id="168" w:name="研究现状与尚未闭合的空白"/>
     <w:p>
       <w:pPr>
         <w:pStyle w:val="Heading3"/>
       </w:pPr>
       <w:r>
-        <w:t xml:space="preserve">1.2.5 </w:t>
+        <w:t xml:space="preserve">1.2.4 </w:t>
       </w:r>
       <w:r>
         <w:rPr>
@@ -9583,7 +9147,7 @@
         <w:rPr>
           <w:rFonts w:hint="eastAsia"/>
         </w:rPr>
-        <w:t xml:space="preserve">1.2.1至1.2.4节区分了概率二值器件随机性的两种利用方式，即无记忆采样与有状态动力学；围绕两者的研究亦循此分野展开，各自相对成熟，却都尚未闭合。先看无记忆采样一侧：聚焦MRAM-PBNN这一子方向的文献可沿三条相对独立的线索分类。</w:t>
+        <w:t xml:space="preserve">1.2.1至1.2.3节区分了概率二值器件随机性的两种利用方式，即无记忆采样与有状态动力学；围绕两者的研究亦循此分野展开，各自相对成熟，却都尚未闭合。先看无记忆采样一侧：聚焦MRAM-PBNN这一子方向的文献可沿三条相对独立的线索分类。</w:t>
       </w:r>
     </w:p>
     <w:p>
@@ -9600,7 +9164,7 @@
         <w:rPr>
           <w:rStyle w:val="FootnoteReference"/>
         </w:rPr>
-        <w:footnoteReference w:id="141"/>
+        <w:footnoteReference w:id="140"/>
       </w:r>
       <w:r>
         <w:rPr>
@@ -9621,7 +9185,7 @@
         <w:rPr>
           <w:rStyle w:val="FootnoteReference"/>
         </w:rPr>
-        <w:footnoteReference w:id="143"/>
+        <w:footnoteReference w:id="142"/>
       </w:r>
       <w:r>
         <w:rPr>
@@ -9633,7 +9197,7 @@
         <w:rPr>
           <w:rStyle w:val="FootnoteReference"/>
         </w:rPr>
-        <w:footnoteReference w:id="145"/>
+        <w:footnoteReference w:id="144"/>
       </w:r>
       <w:r>
         <w:rPr>
@@ -9656,24 +9220,24 @@
         <w:rPr>
           <w:rStyle w:val="FootnoteReference"/>
         </w:rPr>
+        <w:footnoteReference w:id="146"/>
+      </w:r>
+      <w:r>
+        <w:rPr>
+          <w:rFonts w:hint="eastAsia"/>
+        </w:rPr>
+        <w:t xml:space="preserve">；Aadit等人的稀疏伊辛机把问题图稀疏化后在FPGA上实现6个数量级的Gibbs采样加速</w:t>
+      </w:r>
+      <w:r>
+        <w:rPr>
+          <w:rStyle w:val="FootnoteReference"/>
+        </w:rPr>
         <w:footnoteReference w:id="147"/>
       </w:r>
       <w:r>
         <w:rPr>
           <w:rFonts w:hint="eastAsia"/>
         </w:rPr>
-        <w:t xml:space="preserve">；Aadit等人的稀疏伊辛机把问题图稀疏化后在FPGA上实现6个数量级的Gibbs采样加速</w:t>
-      </w:r>
-      <w:r>
-        <w:rPr>
-          <w:rStyle w:val="FootnoteReference"/>
-        </w:rPr>
-        <w:footnoteReference w:id="148"/>
-      </w:r>
-      <w:r>
-        <w:rPr>
-          <w:rFonts w:hint="eastAsia"/>
-        </w:rPr>
         <w:t xml:space="preserve">；后续sMTJ与VCMA-MTJ器件研究又把随机电报噪声推进至纳秒、亚纳秒量级，并提供了可调概率台阶。这一线索主要服务于组合优化与玻尔兹曼采样，对前馈神经网络所需按层有序更新的适配尚在起步阶段，前馈sMTJ-p-bit演示是其中一个重要转折。此外，这一线索的评估重心在演示求解可行性；器件非理想性对求解成功率的灵敏度结构，以及与CMOS</w:t>
       </w:r>
       <w:r>
@@ -9700,7 +9264,7 @@
         <w:rPr>
           <w:rStyle w:val="FootnoteReference"/>
         </w:rPr>
-        <w:footnoteReference w:id="150"/>
+        <w:footnoteReference w:id="149"/>
       </w:r>
       <w:r>
         <w:rPr>
@@ -9712,7 +9276,7 @@
         <w:rPr>
           <w:rStyle w:val="FootnoteReference"/>
         </w:rPr>
-        <w:footnoteReference w:id="152"/>
+        <w:footnoteReference w:id="151"/>
       </w:r>
       <w:r>
         <w:rPr>
@@ -9746,7 +9310,7 @@
         <w:rPr>
           <w:rStyle w:val="FootnoteReference"/>
         </w:rPr>
-        <w:footnoteReference w:id="154"/>
+        <w:footnoteReference w:id="153"/>
       </w:r>
       <w:r>
         <w:rPr>
@@ -9758,7 +9322,7 @@
         <w:rPr>
           <w:rStyle w:val="FootnoteReference"/>
         </w:rPr>
-        <w:footnoteReference w:id="156"/>
+        <w:footnoteReference w:id="155"/>
       </w:r>
       <w:r>
         <w:rPr>
@@ -9770,25 +9334,25 @@
         <w:rPr>
           <w:rStyle w:val="FootnoteReference"/>
         </w:rPr>
+        <w:footnoteReference w:id="157"/>
+      </w:r>
+      <w:r>
+        <w:rPr>
+          <w:rFonts w:hint="eastAsia"/>
+        </w:rPr>
+        <w:t xml:space="preserve">；忆阻器与原子开关网络、软体与机械系统以及自旋电子学等多种介质随后相继被验证，相关进展已有系统综述</w:t>
+      </w:r>
+      <w:r>
+        <w:rPr>
+          <w:rStyle w:val="FootnoteReference"/>
+        </w:rPr>
         <w:footnoteReference w:id="158"/>
       </w:r>
       <w:r>
         <w:rPr>
-          <w:rFonts w:hint="eastAsia"/>
-        </w:rPr>
-        <w:t xml:space="preserve">；忆阻器与原子开关网络、软体与机械系统以及自旋电子学等多种介质随后相继被验证，相关进展已有系统综述</w:t>
-      </w:r>
-      <w:r>
-        <w:rPr>
-          <w:rStyle w:val="FootnoteReference"/>
-        </w:rPr>
-        <w:footnoteReference w:id="159"/>
-      </w:r>
-      <w:r>
-        <w:rPr>
-          <w:rStyle w:val="FootnoteReference"/>
-        </w:rPr>
-        <w:footnoteReference w:id="161"/>
+          <w:rStyle w:val="FootnoteReference"/>
+        </w:rPr>
+        <w:footnoteReference w:id="160"/>
       </w:r>
       <w:r>
         <w:rPr>
@@ -9800,7 +9364,7 @@
         <w:rPr>
           <w:rStyle w:val="FootnoteReference"/>
         </w:rPr>
-        <w:footnoteReference w:id="163"/>
+        <w:footnoteReference w:id="162"/>
       </w:r>
       <w:r>
         <w:rPr>
@@ -9812,7 +9376,7 @@
         <w:rPr>
           <w:rStyle w:val="FootnoteReference"/>
         </w:rPr>
-        <w:footnoteReference w:id="165"/>
+        <w:footnoteReference w:id="164"/>
       </w:r>
       <w:r>
         <w:rPr>
@@ -9871,7 +9435,7 @@
         <w:rPr>
           <w:rStyle w:val="FootnoteReference"/>
         </w:rPr>
-        <w:footnoteReference w:id="167"/>
+        <w:footnoteReference w:id="166"/>
       </w:r>
       <w:r>
         <w:rPr>
@@ -9891,8 +9455,8 @@
         <w:t xml:space="preserve">综观两侧，无记忆采样侧的空白在于映射方式，即尚未把精度维度从空间真正搬到时间；有状态动力学侧的空白在于器件适配性，即随机翻转器件能否充当储备池节点尚无定论。二者彼此独立，却共享同一个机会：已校准的sMTJ既可作瞬时随机源，又可作有状态的动力学节点。本文正从这一组缺口切入。</w:t>
       </w:r>
     </w:p>
+    <w:bookmarkEnd w:id="168"/>
     <w:bookmarkEnd w:id="169"/>
-    <w:bookmarkEnd w:id="170"/>
     <w:bookmarkStart w:id="185" w:name="研究思路与本文组织"/>
     <w:p>
       <w:pPr>
@@ -9943,10 +9507,10 @@
         <w:rPr>
           <w:rFonts w:hint="eastAsia"/>
         </w:rPr>
-        <w:t xml:space="preserve">(1.3.3节)，把同一器件的时域相关性用作衰减记忆，将其任务域延伸至储备池计算这一第三类任务。前两者面向无记忆采样，着力于以更低的硬件代价换取所需精度；后者把可用资源从瞬时随机性延伸到时域动力学。三项贡献由四段工作承载：器件建模平台提供三类任务共享的物理基础，伊辛求解评估回应1.2.5节所指的求解侧评估空白并给出同一阵列多任务能力的第一类证据，PBNN仿真落实范式与架构两个层面的创新，储备池评估落实任务层面的创新。各段共享同一器件级Sigmoid接口与同一仿真后端，1.3.4节据此汇总并给出全文组织。</w:t>
-      </w:r>
-    </w:p>
-    <w:bookmarkStart w:id="179" w:name="精度承载由空间展开转向时域展开"/>
+        <w:t xml:space="preserve">(1.3.3节)，把同一器件的时域相关性用作衰减记忆，将其任务域延伸至储备池计算这一第三类任务。前两者面向无记忆采样，着力于以更低的硬件代价换取所需精度；后者把可用资源从瞬时随机性延伸到时域动力学。三项贡献由四段工作承载：器件建模平台提供三类任务共享的物理基础，伊辛求解评估回应1.2.4节所指的求解侧评估空白并给出同一阵列多任务能力的第一类证据，PBNN仿真落实范式与架构两个层面的创新，储备池评估落实任务层面的创新。各段共享同一器件级Sigmoid接口与同一仿真后端，1.3.4节据此汇总并给出全文组织。</w:t>
+      </w:r>
+    </w:p>
+    <w:bookmarkStart w:id="178" w:name="精度承载由空间展开转向时域展开"/>
     <w:p>
       <w:pPr>
         <w:pStyle w:val="Heading3"/>
@@ -10035,7 +9599,7 @@
         <w:rPr>
           <w:rStyle w:val="FootnoteReference"/>
         </w:rPr>
-        <w:footnoteReference w:id="171"/>
+        <w:footnoteReference w:id="170"/>
       </w:r>
       <w:r>
         <w:rPr>
@@ -10090,18 +9654,18 @@
           <wp:inline>
             <wp:extent cx="5334000" cy="3479707"/>
             <wp:effectExtent b="0" l="0" r="0" t="0"/>
-            <wp:docPr descr="" title="" id="173" name="Picture"/>
+            <wp:docPr descr="" title="" id="172" name="Picture"/>
             <a:graphic>
               <a:graphicData uri="http://schemas.openxmlformats.org/drawingml/2006/picture">
                 <pic:pic>
                   <pic:nvPicPr>
-                    <pic:cNvPr descr="./figs/Chapter01_local_03.png" id="174" name="Picture"/>
+                    <pic:cNvPr descr="./figs/Chapter01_local_03.png" id="173" name="Picture"/>
                     <pic:cNvPicPr>
                       <a:picLocks noChangeArrowheads="1" noChangeAspect="1"/>
                     </pic:cNvPicPr>
                   </pic:nvPicPr>
                   <pic:blipFill>
-                    <a:blip r:embed="rId172"/>
+                    <a:blip r:embed="rId171"/>
                     <a:stretch>
                       <a:fillRect/>
                     </a:stretch>
@@ -10622,13 +10186,13 @@
         <w:rPr>
           <w:rStyle w:val="FootnoteReference"/>
         </w:rPr>
-        <w:footnoteReference w:id="175"/>
-      </w:r>
-      <w:r>
-        <w:rPr>
-          <w:rFonts w:hint="eastAsia"/>
-        </w:rPr>
-        <w:t xml:space="preserve">。第三层是阵列规模与矩阵规模的解耦：因</w:t>
+        <w:footnoteReference w:id="174"/>
+      </w:r>
+      <w:r>
+        <w:rPr>
+          <w:rFonts w:hint="eastAsia"/>
+        </w:rPr>
+        <w:t xml:space="preserve">。第三层是阵列规模与矩阵规模的解耦：因分布参数</w:t>
       </w:r>
       <m:oMath>
         <m:sSub>
@@ -10651,16 +10215,16 @@
         <w:rPr>
           <w:rFonts w:hint="eastAsia"/>
         </w:rPr>
-        <w:t xml:space="preserve">存于外围数字域</w:t>
-      </w:r>
-      <w:r>
-        <w:t xml:space="preserve"> </w:t>
-      </w:r>
-      <w:r>
-        <w:rPr>
-          <w:rFonts w:hint="eastAsia"/>
-        </w:rPr>
-        <w:t xml:space="preserve">(1.2.3节)，同一物理阵列可逐块装载不同子块的分布参数、各采样</w:t>
+        <w:t xml:space="preserve">以数字码字存于外围而非阵列内</w:t>
+      </w:r>
+      <w:r>
+        <w:t xml:space="preserve"> </w:t>
+      </w:r>
+      <w:r>
+        <w:rPr>
+          <w:rFonts w:hint="eastAsia"/>
+        </w:rPr>
+        <w:t xml:space="preserve">(第四章)，同一物理阵列可逐块装载不同子块的分布参数、各采样</w:t>
       </w:r>
       <m:oMath>
         <m:r>
@@ -10795,24 +10359,24 @@
         <w:rPr>
           <w:rStyle w:val="FootnoteReference"/>
         </w:rPr>
+        <w:footnoteReference w:id="176"/>
+      </w:r>
+      <w:r>
+        <w:rPr>
+          <w:rFonts w:hint="eastAsia"/>
+        </w:rPr>
+        <w:t xml:space="preserve">、随机翻转的纳秒级操作已获演示</w:t>
+      </w:r>
+      <w:r>
+        <w:rPr>
+          <w:rStyle w:val="FootnoteReference"/>
+        </w:rPr>
         <w:footnoteReference w:id="177"/>
       </w:r>
       <w:r>
         <w:rPr>
           <w:rFonts w:hint="eastAsia"/>
         </w:rPr>
-        <w:t xml:space="preserve">、随机翻转的纳秒级操作已获演示</w:t>
-      </w:r>
-      <w:r>
-        <w:rPr>
-          <w:rStyle w:val="FootnoteReference"/>
-        </w:rPr>
-        <w:footnoteReference w:id="178"/>
-      </w:r>
-      <w:r>
-        <w:rPr>
-          <w:rFonts w:hint="eastAsia"/>
-        </w:rPr>
         <w:t xml:space="preserve">。需要厘清三层收益中已闭合与待验的部分：第一层</w:t>
       </w:r>
       <w:r>
@@ -10861,7 +10425,7 @@
         <w:t xml:space="preserve">(即41%那一项)，其系统级评估留作后续工作，本文只给出机制与代价核算而不作实测声明。就本质而言，这一路线把精度由受物理约束的空间资源改写为可调度的时间资源，是概率取代精度在架构维度的体现。</w:t>
       </w:r>
     </w:p>
-    <w:bookmarkEnd w:id="179"/>
+    <w:bookmarkEnd w:id="178"/>
     <w:bookmarkStart w:id="180" w:name="全自旋概率二值计算架构"/>
     <w:p>
       <w:pPr>
@@ -10896,7 +10460,55 @@
         <w:rPr>
           <w:rFonts w:hint="eastAsia"/>
         </w:rPr>
-        <w:t xml:space="preserve">该设计的协同优势体现在三个层面。存储、采样、乘加三位一体消除了CMOS随机源与存算阵列之间的数据传输，每次采样所需的能量由随机位生成本身支配，而不由数据移动支配。sMTJ的亚纳秒翻转使采样吞吐率与子阵列读出节拍自然对齐，避免了p-bit速率与阵列节拍失配所引入的采样冗余。</w:t>
+        <w:t xml:space="preserve">该设计的协同优势体现在三个层面。存储、采样、乘加三位一体消除了CMOS随机源与存算阵列之间的数据传输，每次采样所需的能量由随机位生成本身支配，而不由数据移动支配：在第二章标定工作点，器件级写耗约0.78</w:t>
+      </w:r>
+      <w:r>
+        <w:t xml:space="preserve"> </w:t>
+      </w:r>
+      <w:r>
+        <w:rPr>
+          <w:rFonts w:hint="eastAsia"/>
+        </w:rPr>
+        <w:t xml:space="preserve">pJ/次，计入sky130写驱动后端到端约1.6</w:t>
+      </w:r>
+      <w:r>
+        <w:t xml:space="preserve"> pJ </w:t>
+      </w:r>
+      <w:r>
+        <w:rPr>
+          <w:rFonts w:hint="eastAsia"/>
+        </w:rPr>
+        <w:t xml:space="preserve">(第四章)，仍低于CMOS</w:t>
+      </w:r>
+      <w:r>
+        <w:t xml:space="preserve"> </w:t>
+      </w:r>
+      <w:r>
+        <w:rPr>
+          <w:rFonts w:hint="eastAsia"/>
+        </w:rPr>
+        <w:t xml:space="preserve">p-bit每次更新约5</w:t>
+      </w:r>
+      <w:r>
+        <w:t xml:space="preserve"> </w:t>
+      </w:r>
+      <w:r>
+        <w:rPr>
+          <w:rFonts w:hint="eastAsia"/>
+        </w:rPr>
+        <w:t xml:space="preserve">pJ的代价</w:t>
+      </w:r>
+      <w:r>
+        <w:rPr>
+          <w:rStyle w:val="FootnoteReference"/>
+        </w:rPr>
+        <w:footnoteReference w:id="179"/>
+      </w:r>
+      <w:r>
+        <w:rPr>
+          <w:rFonts w:hint="eastAsia"/>
+        </w:rPr>
+        <w:t xml:space="preserve">。sMTJ的亚纳秒翻转使采样吞吐率与子阵列读出节拍自然对齐，避免了p-bit速率与阵列节拍失配所引入的采样冗余。</w:t>
       </w:r>
       <m:oMath>
         <m:sSub>
@@ -11032,7 +10644,7 @@
         <w:rPr>
           <w:rFonts w:hint="eastAsia"/>
         </w:rPr>
-        <w:t xml:space="preserve">型依赖提供非线性，磁矩在两态间的随机停留提供衰减记忆，且该停留时间随偏置电压指数可调；而1.2.5节指出的第三项条件——热涨落下的状态可重复性——正是第五章要以定量基准回答的问题。由此，储备池计算中代价最高的稠密递归，即数字回声状态网络需显式存储并每步计算的</w:t>
+        <w:t xml:space="preserve">型依赖提供非线性，磁矩在两态间的随机停留提供衰减记忆，且该停留时间随偏置电压指数可调；而1.2.4节指出的第三项条件——热涨落下的状态可重复性——正是第五章要以定量基准回答的问题。由此，储备池计算中代价最高的稠密递归，即数字回声状态网络需显式存储并每步计算的</w:t>
       </w:r>
       <m:oMath>
         <m:r>
@@ -11081,7 +10693,7 @@
         <w:rPr>
           <w:rFonts w:hint="eastAsia"/>
         </w:rPr>
-        <w:t xml:space="preserve">(能量预算受限、精度要求中等的时序处理，与1.1.1节所述边缘设备的部署约束相合)，从而把1.2.5节所指出的有状态动力学侧空白填补为可复现的定量结论。这一任务把可用的器件资源由前两项创新所依赖的瞬时随机性进一步延伸到时域动力学，与组合优化、机器学习推断共同构成同一硬件单元在不同调度下承担的三类任务。需要说明，储备池模式偏好比概率位写器件更低的势垒，两种模式在同一物理阵列上的统一以电压栅控、分时复用的受限架构提案形式在第五章界定。</w:t>
+        <w:t xml:space="preserve">(能量预算受限、精度要求中等的时序处理，与1.1.1节所述边缘设备的部署约束相合)，从而把1.2.4节所指出的有状态动力学侧空白填补为可复现的定量结论。这一任务把可用的器件资源由前两项创新所依赖的瞬时随机性进一步延伸到时域动力学，与组合优化、机器学习推断共同构成同一硬件单元在不同调度下承担的三类任务。需要说明，储备池模式偏好比概率位写器件更低的势垒，两种模式在同一物理阵列上的统一以电压栅控、分时复用的受限架构提案形式在第五章界定。</w:t>
       </w:r>
     </w:p>
     <w:bookmarkEnd w:id="181"/>
@@ -11149,7 +10761,16 @@
         <w:rPr>
           <w:rFonts w:hint="eastAsia"/>
         </w:rPr>
-        <w:t xml:space="preserve">接口下的伊辛哈密顿量最小化，评估理想Gibbs动力学的求解能力、器件非理想性的灵敏度结构以及跨硬件平台的能耗与时间代价，回应1.2.5节所指的求解侧评估空白。其三，将同一硬件单元转作PBNN的伯努利权重单元，基于PyTorch搭建覆盖器件、阵列、网络、采样、PPA与实验六层的端到端仿真器，量化精度、鲁棒性与能耗在跨架构条件下的相对位置；并在开源sky130工艺上对读出与写入外围作晶体管级协同设计与提取验证，使写线IR压降、读出失调与转换能量以电路级提取仿真口径进入评估——1.1.1节所引的阵列规模约束由此在本文自己的工艺平台上得到印证。其四，将同一器件用作概率二值储备池计算的随机动力学节点，利用其磁矩在两态间随机停留所形成的衰减记忆承担时序处理任务，给出面向储备池优化的器件参数指导与相对数字回声状态网络的硬件能效评估；这一任务把可用的器件资源由其二、其三两段所依赖的瞬时随机性进一步延伸到时域动力学。上述工作共享同一器件级Sigmoid接口</w:t>
+        <w:t xml:space="preserve">接口下的伊辛哈密顿量最小化，评估理想Gibbs动力学的求解能力、器件非理想性的灵敏度结构以及跨硬件平台的能耗与时间代价，回应1.2.4节所指的求解侧评估空白。其三，将同一硬件单元转作PBNN的伯努利权重单元，基于PyTorch搭建覆盖器件、阵列、网络、采样、PPA与实验六层的端到端仿真器，量化精度、鲁棒性与能耗在跨架构条件下的相对位置；并在开源sky130工艺上对读出与写入外围作晶体管级协同设计与提取验证，使写线IR压降、读出失调与转换能量以电路级提取仿真口径进入评估——1.1.1节所引的阵列规模约束由此在本文自己的工艺平台上得到印证</w:t>
+      </w:r>
+      <w:r>
+        <w:t xml:space="preserve"> </w:t>
+      </w:r>
+      <w:r>
+        <w:rPr>
+          <w:rFonts w:hint="eastAsia"/>
+        </w:rPr>
+        <w:t xml:space="preserve">(256列写线往返压降约达写负载的16.5%)。其四，将同一器件用作概率二值储备池计算的随机动力学节点，利用其磁矩在两态间随机停留所形成的衰减记忆承担时序处理任务，给出面向储备池优化的器件参数指导与相对数字回声状态网络的硬件能效评估；这一任务把可用的器件资源由其二、其三两段所依赖的瞬时随机性进一步延伸到时域动力学。上述工作共享同一器件级Sigmoid接口</w:t>
       </w:r>
       <m:oMath>
         <m:r>
@@ -13871,7 +13492,7 @@
       </w:hyperlink>
     </w:p>
   </w:footnote>
-  <w:footnote w:id="138">
+  <w:footnote w:id="137">
     <w:p>
       <w:pPr>
         <w:pStyle w:val="FootnoteText"/>
@@ -13904,7 +13525,7 @@
       <w:r>
         <w:t xml:space="preserve"> </w:t>
       </w:r>
-      <w:hyperlink r:id="rId139">
+      <w:hyperlink r:id="rId138">
         <w:r>
           <w:rPr>
             <w:rStyle w:val="Hyperlink"/>
@@ -13914,7 +13535,7 @@
       </w:hyperlink>
     </w:p>
   </w:footnote>
-  <w:footnote w:id="141">
+  <w:footnote w:id="140">
     <w:p>
       <w:pPr>
         <w:pStyle w:val="FootnoteText"/>
@@ -13947,7 +13568,7 @@
       <w:r>
         <w:t xml:space="preserve"> </w:t>
       </w:r>
-      <w:hyperlink r:id="rId142">
+      <w:hyperlink r:id="rId141">
         <w:r>
           <w:rPr>
             <w:rStyle w:val="Hyperlink"/>
@@ -13957,7 +13578,7 @@
       </w:hyperlink>
     </w:p>
   </w:footnote>
-  <w:footnote w:id="143">
+  <w:footnote w:id="142">
     <w:p>
       <w:pPr>
         <w:pStyle w:val="FootnoteText"/>
@@ -13990,7 +13611,7 @@
       <w:r>
         <w:t xml:space="preserve"> </w:t>
       </w:r>
-      <w:hyperlink r:id="rId144">
+      <w:hyperlink r:id="rId143">
         <w:r>
           <w:rPr>
             <w:rStyle w:val="Hyperlink"/>
@@ -14000,7 +13621,7 @@
       </w:hyperlink>
     </w:p>
   </w:footnote>
-  <w:footnote w:id="145">
+  <w:footnote w:id="144">
     <w:p>
       <w:pPr>
         <w:pStyle w:val="FootnoteText"/>
@@ -14033,7 +13654,7 @@
       <w:r>
         <w:t xml:space="preserve"> </w:t>
       </w:r>
-      <w:hyperlink r:id="rId146">
+      <w:hyperlink r:id="rId145">
         <w:r>
           <w:rPr>
             <w:rStyle w:val="Hyperlink"/>
@@ -14043,7 +13664,7 @@
       </w:hyperlink>
     </w:p>
   </w:footnote>
-  <w:footnote w:id="147">
+  <w:footnote w:id="146">
     <w:p>
       <w:pPr>
         <w:pStyle w:val="FootnoteText"/>
@@ -14086,7 +13707,7 @@
       </w:hyperlink>
     </w:p>
   </w:footnote>
-  <w:footnote w:id="148">
+  <w:footnote w:id="147">
     <w:p>
       <w:pPr>
         <w:pStyle w:val="FootnoteText"/>
@@ -14119,7 +13740,7 @@
       <w:r>
         <w:t xml:space="preserve"> </w:t>
       </w:r>
-      <w:hyperlink r:id="rId149">
+      <w:hyperlink r:id="rId148">
         <w:r>
           <w:rPr>
             <w:rStyle w:val="Hyperlink"/>
@@ -14129,7 +13750,7 @@
       </w:hyperlink>
     </w:p>
   </w:footnote>
-  <w:footnote w:id="150">
+  <w:footnote w:id="149">
     <w:p>
       <w:pPr>
         <w:pStyle w:val="FootnoteText"/>
@@ -14149,7 +13770,7 @@
       <w:r>
         <w:t xml:space="preserve"> </w:t>
       </w:r>
-      <w:hyperlink r:id="rId151">
+      <w:hyperlink r:id="rId150">
         <w:r>
           <w:rPr>
             <w:rStyle w:val="Hyperlink"/>
@@ -14162,7 +13783,7 @@
       </w:r>
     </w:p>
   </w:footnote>
-  <w:footnote w:id="152">
+  <w:footnote w:id="151">
     <w:p>
       <w:pPr>
         <w:pStyle w:val="FootnoteText"/>
@@ -14182,7 +13803,7 @@
       <w:r>
         <w:t xml:space="preserve"> </w:t>
       </w:r>
-      <w:hyperlink r:id="rId153">
+      <w:hyperlink r:id="rId152">
         <w:r>
           <w:rPr>
             <w:rStyle w:val="Hyperlink"/>
@@ -14195,7 +13816,7 @@
       </w:r>
     </w:p>
   </w:footnote>
-  <w:footnote w:id="154">
+  <w:footnote w:id="153">
     <w:p>
       <w:pPr>
         <w:pStyle w:val="FootnoteText"/>
@@ -14228,7 +13849,7 @@
       <w:r>
         <w:t xml:space="preserve"> </w:t>
       </w:r>
-      <w:hyperlink r:id="rId155">
+      <w:hyperlink r:id="rId154">
         <w:r>
           <w:rPr>
             <w:rStyle w:val="Hyperlink"/>
@@ -14238,7 +13859,7 @@
       </w:hyperlink>
     </w:p>
   </w:footnote>
-  <w:footnote w:id="156">
+  <w:footnote w:id="155">
     <w:p>
       <w:pPr>
         <w:pStyle w:val="FootnoteText"/>
@@ -14271,7 +13892,7 @@
       <w:r>
         <w:t xml:space="preserve"> </w:t>
       </w:r>
-      <w:hyperlink r:id="rId157">
+      <w:hyperlink r:id="rId156">
         <w:r>
           <w:rPr>
             <w:rStyle w:val="Hyperlink"/>
@@ -14281,7 +13902,7 @@
       </w:hyperlink>
     </w:p>
   </w:footnote>
-  <w:footnote w:id="158">
+  <w:footnote w:id="157">
     <w:p>
       <w:pPr>
         <w:pStyle w:val="FootnoteText"/>
@@ -14314,7 +13935,7 @@
       <w:r>
         <w:t xml:space="preserve"> </w:t>
       </w:r>
-      <w:hyperlink r:id="rId139">
+      <w:hyperlink r:id="rId138">
         <w:r>
           <w:rPr>
             <w:rStyle w:val="Hyperlink"/>
@@ -14324,7 +13945,7 @@
       </w:hyperlink>
     </w:p>
   </w:footnote>
-  <w:footnote w:id="159">
+  <w:footnote w:id="158">
     <w:p>
       <w:pPr>
         <w:pStyle w:val="FootnoteText"/>
@@ -14357,7 +13978,7 @@
       <w:r>
         <w:t xml:space="preserve"> </w:t>
       </w:r>
-      <w:hyperlink r:id="rId160">
+      <w:hyperlink r:id="rId159">
         <w:r>
           <w:rPr>
             <w:rStyle w:val="Hyperlink"/>
@@ -14367,7 +13988,7 @@
       </w:hyperlink>
     </w:p>
   </w:footnote>
-  <w:footnote w:id="161">
+  <w:footnote w:id="160">
     <w:p>
       <w:pPr>
         <w:pStyle w:val="FootnoteText"/>
@@ -14400,7 +14021,7 @@
       <w:r>
         <w:t xml:space="preserve"> </w:t>
       </w:r>
-      <w:hyperlink r:id="rId162">
+      <w:hyperlink r:id="rId161">
         <w:r>
           <w:rPr>
             <w:rStyle w:val="Hyperlink"/>
@@ -14410,7 +14031,7 @@
       </w:hyperlink>
     </w:p>
   </w:footnote>
-  <w:footnote w:id="163">
+  <w:footnote w:id="162">
     <w:p>
       <w:pPr>
         <w:pStyle w:val="FootnoteText"/>
@@ -14443,7 +14064,7 @@
       <w:r>
         <w:t xml:space="preserve"> </w:t>
       </w:r>
-      <w:hyperlink r:id="rId164">
+      <w:hyperlink r:id="rId163">
         <w:r>
           <w:rPr>
             <w:rStyle w:val="Hyperlink"/>
@@ -14453,7 +14074,7 @@
       </w:hyperlink>
     </w:p>
   </w:footnote>
-  <w:footnote w:id="165">
+  <w:footnote w:id="164">
     <w:p>
       <w:pPr>
         <w:pStyle w:val="FootnoteText"/>
@@ -14486,7 +14107,7 @@
       <w:r>
         <w:t xml:space="preserve"> </w:t>
       </w:r>
-      <w:hyperlink r:id="rId166">
+      <w:hyperlink r:id="rId165">
         <w:r>
           <w:rPr>
             <w:rStyle w:val="Hyperlink"/>
@@ -14496,7 +14117,7 @@
       </w:hyperlink>
     </w:p>
   </w:footnote>
-  <w:footnote w:id="167">
+  <w:footnote w:id="166">
     <w:p>
       <w:pPr>
         <w:pStyle w:val="FootnoteText"/>
@@ -14516,7 +14137,7 @@
       <w:r>
         <w:t xml:space="preserve"> </w:t>
       </w:r>
-      <w:hyperlink r:id="rId168">
+      <w:hyperlink r:id="rId167">
         <w:r>
           <w:rPr>
             <w:rStyle w:val="Hyperlink"/>
@@ -14529,7 +14150,7 @@
       </w:r>
     </w:p>
   </w:footnote>
-  <w:footnote w:id="171">
+  <w:footnote w:id="170">
     <w:p>
       <w:pPr>
         <w:pStyle w:val="FootnoteText"/>
@@ -14572,7 +14193,7 @@
       </w:hyperlink>
     </w:p>
   </w:footnote>
-  <w:footnote w:id="175">
+  <w:footnote w:id="174">
     <w:p>
       <w:pPr>
         <w:pStyle w:val="FootnoteText"/>
@@ -14605,7 +14226,7 @@
       <w:r>
         <w:t xml:space="preserve"> </w:t>
       </w:r>
-      <w:hyperlink r:id="rId176">
+      <w:hyperlink r:id="rId175">
         <w:r>
           <w:rPr>
             <w:rStyle w:val="Hyperlink"/>
@@ -14615,7 +14236,7 @@
       </w:hyperlink>
     </w:p>
   </w:footnote>
-  <w:footnote w:id="177">
+  <w:footnote w:id="176">
     <w:p>
       <w:pPr>
         <w:pStyle w:val="FootnoteText"/>
@@ -14658,7 +14279,7 @@
       </w:hyperlink>
     </w:p>
   </w:footnote>
-  <w:footnote w:id="178">
+  <w:footnote w:id="177">
     <w:p>
       <w:pPr>
         <w:pStyle w:val="FootnoteText"/>
@@ -14697,6 +14318,49 @@
             <w:rStyle w:val="Hyperlink"/>
           </w:rPr>
           <w:t xml:space="preserve">doi:10.1021/acs.nanolett.0c04652</w:t>
+        </w:r>
+      </w:hyperlink>
+    </w:p>
+  </w:footnote>
+  <w:footnote w:id="179">
+    <w:p>
+      <w:pPr>
+        <w:pStyle w:val="FootnoteText"/>
+      </w:pPr>
+      <w:r>
+        <w:rPr>
+          <w:rStyle w:val="FootnoteReference"/>
+        </w:rPr>
+        <w:footnoteRef/>
+      </w:r>
+      <w:r>
+        <w:t xml:space="preserve"> </w:t>
+      </w:r>
+      <w:r>
+        <w:t xml:space="preserve">Camsari K Y, Sutton B M, Datta S. p-bits for probabilistic spin logic.</w:t>
+      </w:r>
+      <w:r>
+        <w:t xml:space="preserve"> </w:t>
+      </w:r>
+      <w:r>
+        <w:rPr>
+          <w:i/>
+          <w:iCs/>
+        </w:rPr>
+        <w:t xml:space="preserve">Applied Physics Reviews</w:t>
+      </w:r>
+      <w:r>
+        <w:t xml:space="preserve">, 2019, 6(1): 011305.</w:t>
+      </w:r>
+      <w:r>
+        <w:t xml:space="preserve"> </w:t>
+      </w:r>
+      <w:hyperlink r:id="rId109">
+        <w:r>
+          <w:rPr>
+            <w:rStyle w:val="Hyperlink"/>
+          </w:rPr>
+          <w:t xml:space="preserve">doi:10.1063/1.5055860</w:t>
         </w:r>
       </w:hyperlink>
     </w:p>

</xml_diff>